<commit_message>
docs: migrate documentation and codebase configuration to modern Flet framework
</commit_message>
<xml_diff>
--- a/docs/data_pipeline.docx
+++ b/docs/data_pipeline.docx
@@ -233,7 +233,7 @@
           <w:sz w:val="24"/>
           <w:szCs w:val="24"/>
         </w:rPr>
-        <w:t xml:space="preserve">This document describes the architecture and implementation of three tightly coupled modules: pipeline.py, which orchestrates the end-to-end inference loop; action_engine.py, which manages the lifecycle of process suspensions; and notifier.py, which dispatches non-blocking Windows Toast alerts. Together, these modules translate AI predictions into concrete, reversible system interventions.</w:t>
+        <w:t>This document describes the architecture and implementation of three tightly coupled modules: src/core/pipeline.py, which orchestrates the end-to-end inference loop; src/core/action_engine.py, which manages the lifecycle of process suspensions; and src/core/notifier.py, which dispatches non-blocking Windows Toast alerts. Together, these modules translate AI predictions into concrete, reversible system interventions.</w:t>
       </w:r>
     </w:p>
     <w:p>
@@ -331,7 +331,7 @@
           <w:sz w:val="24"/>
           <w:szCs w:val="24"/>
         </w:rPr>
-        <w:t xml:space="preserve">The pipeline thread communicates results to the PyQt6 dashboard via an on_result callback — a function reference passed at construction time. This callback is invoked on the pipeline thread, and the UI must use Qt signal/slot mechanisms to safely consume results on the main thread. This separation ensures that a slow UI render never blocks the pipeline loop.</w:t>
+        <w:t>The pipeline thread communicates results to the Flet dashboard via an on_result callback — a function reference passed at construction time. This callback is invoked on the pipeline thread, putting results into a thread-safe Queue. The Flet UI consumes these results asynchronously using a background polling thread and updates the UI on the main thread event loop via Flet's asynchronous pipeline. This separation ensures that a slow UI render never blocks the pipeline loop.</w:t>
       </w:r>
     </w:p>
     <w:p>
@@ -1310,7 +1310,7 @@
                 <w:sz w:val="22"/>
                 <w:szCs w:val="22"/>
               </w:rPr>
-              <w:t xml:space="preserve">Pipeline → Qt signal</w:t>
+              <w:t>Pipeline → Thread-safe Queue &amp; Flet Async Task</w:t>
             </w:r>
           </w:p>
         </w:tc>

</xml_diff>